<commit_message>
fix: plantilla contrato-trabajo corregida segun formato.
</commit_message>
<xml_diff>
--- a/plantillas/contrato-trabajo.docx
+++ b/plantillas/contrato-trabajo.docx
@@ -38,8 +38,6 @@
                 <w:lang w:val="es-ES_tradnl" w:eastAsia="es-ES"/>
               </w:rPr>
             </w:pPr>
-            <w:bookmarkStart w:id="0" w:name="_GoBack"/>
-            <w:bookmarkEnd w:id="0"/>
             <w:r>
               <w:rPr>
                 <w:rFonts w:ascii="Arial" w:eastAsia="Arial" w:hAnsi="Arial" w:cs="Arial"/>
@@ -448,6 +446,15 @@
               <w:fldChar w:fldCharType="begin"/>
             </w:r>
             <w:r>
+              <w:instrText xml:space="preserve"> INCLUDEPICTURE  \d "C:\\Users\\Constanza.Ramos\\Logos\\conadi.png" \* MERGEFORMATINET </w:instrText>
+            </w:r>
+            <w:r>
+              <w:fldChar w:fldCharType="separate"/>
+            </w:r>
+            <w:r>
+              <w:fldChar w:fldCharType="begin"/>
+            </w:r>
+            <w:r>
               <w:instrText xml:space="preserve"> </w:instrText>
             </w:r>
             <w:r>
@@ -513,6 +520,9 @@
               <w:fldChar w:fldCharType="end"/>
             </w:r>
             <w:r>
+              <w:fldChar w:fldCharType="end"/>
+            </w:r>
+            <w:r>
               <w:instrText xml:space="preserve">" ""  </w:instrText>
             </w:r>
             <w:r>
@@ -2160,88 +2170,9 @@
         <w:rPr>
           <w:rFonts w:ascii="Arial" w:hAnsi="Arial" w:cs="Arial"/>
           <w:sz w:val="18"/>
-        </w:rPr>
-        <w:fldChar w:fldCharType="begin"/>
-      </w:r>
-      <w:r>
-        <w:rPr>
-          <w:rFonts w:ascii="Arial" w:hAnsi="Arial" w:cs="Arial"/>
-          <w:sz w:val="18"/>
-        </w:rPr>
-        <w:instrText xml:space="preserve"> IF </w:instrText>
-      </w:r>
-      <w:r>
-        <w:rPr>
-          <w:rFonts w:ascii="Arial" w:hAnsi="Arial" w:cs="Arial"/>
-          <w:sz w:val="18"/>
-        </w:rPr>
-        <w:fldChar w:fldCharType="begin"/>
-      </w:r>
-      <w:r>
-        <w:rPr>
-          <w:rFonts w:ascii="Arial" w:hAnsi="Arial" w:cs="Arial"/>
-          <w:sz w:val="18"/>
-        </w:rPr>
-        <w:instrText xml:space="preserve"> MERGEFIELD GENERO </w:instrText>
-      </w:r>
-      <w:r>
-        <w:rPr>
-          <w:rFonts w:ascii="Arial" w:hAnsi="Arial" w:cs="Arial"/>
-          <w:sz w:val="18"/>
-        </w:rPr>
-        <w:fldChar w:fldCharType="separate"/>
-      </w:r>
-      <w:r>
-        <w:rPr>
-          <w:rFonts w:ascii="Arial" w:hAnsi="Arial" w:cs="Arial"/>
-          <w:noProof/>
-          <w:sz w:val="18"/>
-        </w:rPr>
-        <w:instrText>M</w:instrText>
-      </w:r>
-      <w:r>
-        <w:rPr>
-          <w:rFonts w:ascii="Arial" w:hAnsi="Arial" w:cs="Arial"/>
-          <w:sz w:val="18"/>
-        </w:rPr>
-        <w:fldChar w:fldCharType="end"/>
-      </w:r>
-      <w:r>
-        <w:rPr>
-          <w:rFonts w:ascii="Arial" w:hAnsi="Arial" w:cs="Arial"/>
-          <w:sz w:val="18"/>
-        </w:rPr>
-        <w:instrText xml:space="preserve"> = "F" "la" "el" </w:instrText>
-      </w:r>
-      <w:r>
-        <w:rPr>
-          <w:rFonts w:ascii="Arial" w:hAnsi="Arial" w:cs="Arial"/>
-          <w:sz w:val="18"/>
-        </w:rPr>
-        <w:fldChar w:fldCharType="separate"/>
-      </w:r>
-      <w:r>
-        <w:rPr>
-          <w:rFonts w:ascii="Arial" w:hAnsi="Arial" w:cs="Arial"/>
-          <w:noProof/>
-          <w:sz w:val="18"/>
-        </w:rPr>
-        <w:t>el</w:t>
-      </w:r>
-      <w:r>
-        <w:rPr>
-          <w:rFonts w:ascii="Arial" w:hAnsi="Arial" w:cs="Arial"/>
-          <w:sz w:val="18"/>
-        </w:rPr>
-        <w:fldChar w:fldCharType="end"/>
-      </w:r>
-      <w:r>
-        <w:rPr>
-          <w:rFonts w:ascii="Arial" w:hAnsi="Arial" w:cs="Arial"/>
-          <w:sz w:val="18"/>
-          <w:szCs w:val="18"/>
-        </w:rPr>
-        <w:t xml:space="preserve"> “</w:t>
+          <w:szCs w:val="18"/>
+        </w:rPr>
+        <w:t>“</w:t>
       </w:r>
       <w:r>
         <w:rPr>
@@ -7093,7 +7024,6 @@
         </w:tabs>
         <w:spacing w:after="0" w:line="240" w:lineRule="auto"/>
         <w:ind w:left="1418" w:right="-23" w:hanging="1418"/>
-        <w:jc w:val="both"/>
         <w:rPr>
           <w:rFonts w:ascii="Arial" w:eastAsia="Times New Roman" w:hAnsi="Arial" w:cs="Arial"/>
           <w:sz w:val="18"/>
@@ -7197,7 +7127,18 @@
           <w:sz w:val="18"/>
           <w:szCs w:val="18"/>
         </w:rPr>
-        <w:t>}  {</w:t>
+        <w:t xml:space="preserve">} </w:t>
+      </w:r>
+      <w:r>
+        <w:rPr>
+          <w:rFonts w:ascii="Arial" w:eastAsia="Arial" w:hAnsi="Arial" w:cs="Arial"/>
+          <w:b/>
+          <w:color w:val="0F0F0F"/>
+          <w:position w:val="1"/>
+          <w:sz w:val="18"/>
+          <w:szCs w:val="18"/>
+        </w:rPr>
+        <w:t>{</w:t>
       </w:r>
       <w:proofErr w:type="spellStart"/>
       <w:r>
@@ -7221,7 +7162,18 @@
           <w:sz w:val="18"/>
           <w:szCs w:val="18"/>
         </w:rPr>
-        <w:t>}  {</w:t>
+        <w:t xml:space="preserve">} </w:t>
+      </w:r>
+      <w:r>
+        <w:rPr>
+          <w:rFonts w:ascii="Arial" w:eastAsia="Arial" w:hAnsi="Arial" w:cs="Arial"/>
+          <w:b/>
+          <w:color w:val="0F0F0F"/>
+          <w:position w:val="1"/>
+          <w:sz w:val="18"/>
+          <w:szCs w:val="18"/>
+        </w:rPr>
+        <w:t>{</w:t>
       </w:r>
       <w:proofErr w:type="spellStart"/>
       <w:r>
@@ -12515,9 +12467,9 @@
     <w:p>
       <w:pPr>
         <w:tabs>
-          <w:tab w:val="left" w:pos="1418"/>
+          <w:tab w:val="left" w:pos="1276"/>
         </w:tabs>
-        <w:spacing w:after="0" w:line="240" w:lineRule="auto"/>
+        <w:spacing w:after="0" w:line="206" w:lineRule="exact"/>
         <w:ind w:right="68"/>
         <w:jc w:val="both"/>
         <w:rPr>
@@ -12534,635 +12486,58 @@
           <w:sz w:val="18"/>
           <w:szCs w:val="18"/>
         </w:rPr>
-        <w:fldChar w:fldCharType="begin"/>
-      </w:r>
-      <w:r>
-        <w:rPr>
-          <w:rFonts w:ascii="Arial" w:eastAsia="Arial" w:hAnsi="Arial" w:cs="Arial"/>
-          <w:color w:val="111111"/>
-          <w:sz w:val="18"/>
-          <w:szCs w:val="18"/>
-        </w:rPr>
-        <w:instrText xml:space="preserve"> IF </w:instrText>
-      </w:r>
-      <w:r>
-        <w:rPr>
-          <w:rFonts w:ascii="Arial" w:eastAsia="Arial" w:hAnsi="Arial" w:cs="Arial"/>
-          <w:color w:val="111111"/>
-          <w:sz w:val="18"/>
-          <w:szCs w:val="18"/>
-        </w:rPr>
-        <w:fldChar w:fldCharType="begin"/>
-      </w:r>
-      <w:r>
-        <w:rPr>
-          <w:rFonts w:ascii="Arial" w:eastAsia="Arial" w:hAnsi="Arial" w:cs="Arial"/>
-          <w:color w:val="111111"/>
-          <w:sz w:val="18"/>
-          <w:szCs w:val="18"/>
-        </w:rPr>
-        <w:instrText xml:space="preserve"> = </w:instrText>
-      </w:r>
-      <w:r>
-        <w:rPr>
-          <w:rFonts w:ascii="Arial" w:eastAsia="Arial" w:hAnsi="Arial" w:cs="Arial"/>
-          <w:color w:val="111111"/>
-          <w:sz w:val="18"/>
-          <w:szCs w:val="18"/>
-        </w:rPr>
-        <w:fldChar w:fldCharType="begin"/>
-      </w:r>
-      <w:r>
-        <w:rPr>
-          <w:rFonts w:ascii="Arial" w:eastAsia="Arial" w:hAnsi="Arial" w:cs="Arial"/>
-          <w:color w:val="111111"/>
-          <w:sz w:val="18"/>
-          <w:szCs w:val="18"/>
-        </w:rPr>
-        <w:instrText xml:space="preserve">  MERGEFIELD BONO_COL  </w:instrText>
-      </w:r>
-      <w:r>
-        <w:rPr>
-          <w:rFonts w:ascii="Arial" w:eastAsia="Arial" w:hAnsi="Arial" w:cs="Arial"/>
-          <w:color w:val="111111"/>
-          <w:sz w:val="18"/>
-          <w:szCs w:val="18"/>
-        </w:rPr>
-        <w:fldChar w:fldCharType="separate"/>
-      </w:r>
-      <w:r>
-        <w:rPr>
-          <w:rFonts w:ascii="Arial" w:eastAsia="Arial" w:hAnsi="Arial" w:cs="Arial"/>
-          <w:noProof/>
-          <w:color w:val="111111"/>
-          <w:sz w:val="18"/>
-          <w:szCs w:val="18"/>
-        </w:rPr>
-        <w:instrText>60.000</w:instrText>
-      </w:r>
-      <w:r>
-        <w:rPr>
-          <w:rFonts w:ascii="Arial" w:eastAsia="Arial" w:hAnsi="Arial" w:cs="Arial"/>
-          <w:color w:val="111111"/>
-          <w:sz w:val="18"/>
-          <w:szCs w:val="18"/>
-        </w:rPr>
-        <w:fldChar w:fldCharType="end"/>
-      </w:r>
-      <w:r>
-        <w:rPr>
-          <w:rFonts w:ascii="Arial" w:eastAsia="Arial" w:hAnsi="Arial" w:cs="Arial"/>
-          <w:color w:val="111111"/>
-          <w:sz w:val="18"/>
-          <w:szCs w:val="18"/>
-        </w:rPr>
-        <w:instrText xml:space="preserve"> + </w:instrText>
-      </w:r>
-      <w:r>
-        <w:rPr>
-          <w:rFonts w:ascii="Arial" w:eastAsia="Arial" w:hAnsi="Arial" w:cs="Arial"/>
-          <w:color w:val="111111"/>
-          <w:sz w:val="18"/>
-          <w:szCs w:val="18"/>
-        </w:rPr>
-        <w:fldChar w:fldCharType="begin"/>
-      </w:r>
-      <w:r>
-        <w:rPr>
-          <w:rFonts w:ascii="Arial" w:eastAsia="Arial" w:hAnsi="Arial" w:cs="Arial"/>
-          <w:color w:val="111111"/>
-          <w:sz w:val="18"/>
-          <w:szCs w:val="18"/>
-        </w:rPr>
-        <w:instrText xml:space="preserve"> MERGEFIELD BONO_MOV  </w:instrText>
-      </w:r>
-      <w:r>
-        <w:rPr>
-          <w:rFonts w:ascii="Arial" w:eastAsia="Arial" w:hAnsi="Arial" w:cs="Arial"/>
-          <w:color w:val="111111"/>
-          <w:sz w:val="18"/>
-          <w:szCs w:val="18"/>
-        </w:rPr>
-        <w:fldChar w:fldCharType="separate"/>
-      </w:r>
-      <w:r>
-        <w:rPr>
-          <w:rFonts w:ascii="Arial" w:eastAsia="Arial" w:hAnsi="Arial" w:cs="Arial"/>
-          <w:noProof/>
-          <w:color w:val="111111"/>
-          <w:sz w:val="18"/>
-          <w:szCs w:val="18"/>
-        </w:rPr>
-        <w:instrText>60.000</w:instrText>
-      </w:r>
-      <w:r>
-        <w:rPr>
-          <w:rFonts w:ascii="Arial" w:eastAsia="Arial" w:hAnsi="Arial" w:cs="Arial"/>
-          <w:color w:val="111111"/>
-          <w:sz w:val="18"/>
-          <w:szCs w:val="18"/>
-        </w:rPr>
-        <w:fldChar w:fldCharType="end"/>
-      </w:r>
-      <w:r>
-        <w:rPr>
-          <w:rFonts w:ascii="Arial" w:eastAsia="Arial" w:hAnsi="Arial" w:cs="Arial"/>
-          <w:color w:val="111111"/>
-          <w:sz w:val="18"/>
-          <w:szCs w:val="18"/>
-        </w:rPr>
-        <w:instrText xml:space="preserve"> </w:instrText>
-      </w:r>
-      <w:r>
-        <w:rPr>
-          <w:rFonts w:ascii="Arial" w:eastAsia="Arial" w:hAnsi="Arial" w:cs="Arial"/>
-          <w:color w:val="111111"/>
-          <w:sz w:val="18"/>
-          <w:szCs w:val="18"/>
-        </w:rPr>
-        <w:fldChar w:fldCharType="separate"/>
-      </w:r>
-      <w:r>
-        <w:rPr>
-          <w:rFonts w:ascii="Arial" w:eastAsia="Arial" w:hAnsi="Arial" w:cs="Arial"/>
-          <w:noProof/>
-          <w:color w:val="111111"/>
-          <w:sz w:val="18"/>
-          <w:szCs w:val="18"/>
-        </w:rPr>
-        <w:instrText>120.000</w:instrText>
-      </w:r>
-      <w:r>
-        <w:rPr>
-          <w:rFonts w:ascii="Arial" w:eastAsia="Arial" w:hAnsi="Arial" w:cs="Arial"/>
-          <w:color w:val="111111"/>
-          <w:sz w:val="18"/>
-          <w:szCs w:val="18"/>
-        </w:rPr>
-        <w:fldChar w:fldCharType="end"/>
-      </w:r>
-      <w:r>
-        <w:rPr>
-          <w:rFonts w:ascii="Arial" w:eastAsia="Arial" w:hAnsi="Arial" w:cs="Arial"/>
-          <w:color w:val="111111"/>
-          <w:sz w:val="18"/>
-          <w:szCs w:val="18"/>
-        </w:rPr>
-        <w:instrText xml:space="preserve"> &gt; 0 "</w:instrText>
-      </w:r>
-      <w:r>
-        <w:rPr>
-          <w:rFonts w:ascii="Arial" w:eastAsia="Arial" w:hAnsi="Arial" w:cs="Arial"/>
-          <w:color w:val="111111"/>
-          <w:sz w:val="18"/>
-          <w:szCs w:val="18"/>
-        </w:rPr>
-        <w:instrText xml:space="preserve"> </w:instrText>
-      </w:r>
-    </w:p>
-    <w:p>
-      <w:pPr>
-        <w:tabs>
-          <w:tab w:val="left" w:pos="1418"/>
-        </w:tabs>
-        <w:spacing w:after="0" w:line="240" w:lineRule="auto"/>
-        <w:ind w:right="68"/>
-        <w:jc w:val="both"/>
-        <w:rPr>
-          <w:rFonts w:ascii="Arial" w:eastAsia="Arial" w:hAnsi="Arial" w:cs="Arial"/>
-          <w:color w:val="111111"/>
-          <w:sz w:val="18"/>
-          <w:szCs w:val="18"/>
-        </w:rPr>
-      </w:pPr>
-    </w:p>
-    <w:p>
-      <w:pPr>
-        <w:tabs>
-          <w:tab w:val="left" w:pos="1418"/>
-        </w:tabs>
-        <w:spacing w:after="0" w:line="240" w:lineRule="auto"/>
-        <w:ind w:left="862" w:right="68" w:hanging="862"/>
-        <w:jc w:val="both"/>
-        <w:rPr>
-          <w:rFonts w:ascii="Arial" w:eastAsia="Arial" w:hAnsi="Arial" w:cs="Arial"/>
-          <w:color w:val="111111"/>
-          <w:sz w:val="18"/>
-          <w:szCs w:val="18"/>
-        </w:rPr>
-      </w:pPr>
-      <w:r>
-        <w:rPr>
-          <w:rFonts w:ascii="Arial" w:eastAsia="Arial" w:hAnsi="Arial" w:cs="Arial"/>
-          <w:color w:val="111111"/>
-          <w:sz w:val="18"/>
-          <w:szCs w:val="18"/>
-        </w:rPr>
-        <w:instrText>NOVENO</w:instrText>
-      </w:r>
-      <w:r>
-        <w:rPr>
-          <w:rFonts w:ascii="Arial" w:eastAsia="Arial" w:hAnsi="Arial" w:cs="Arial"/>
-          <w:color w:val="111111"/>
-          <w:sz w:val="18"/>
-          <w:szCs w:val="18"/>
-        </w:rPr>
-        <w:instrText>:</w:instrText>
-      </w:r>
-      <w:r>
-        <w:rPr>
-          <w:rFonts w:ascii="Arial" w:eastAsia="Arial" w:hAnsi="Arial" w:cs="Arial"/>
-          <w:color w:val="111111"/>
-          <w:sz w:val="18"/>
-          <w:szCs w:val="18"/>
-        </w:rPr>
-        <w:tab/>
-        <w:instrText xml:space="preserve">Las partes acuerdan que la Corporación otorgará </w:instrText>
-      </w:r>
-      <w:r>
-        <w:rPr>
-          <w:rFonts w:ascii="Arial" w:hAnsi="Arial" w:cs="Arial"/>
-          <w:sz w:val="18"/>
-        </w:rPr>
-        <w:fldChar w:fldCharType="begin"/>
-      </w:r>
-      <w:r>
-        <w:rPr>
-          <w:rFonts w:ascii="Arial" w:hAnsi="Arial" w:cs="Arial"/>
-          <w:sz w:val="18"/>
-        </w:rPr>
-        <w:instrText xml:space="preserve"> IF </w:instrText>
-      </w:r>
-      <w:r>
-        <w:rPr>
-          <w:rFonts w:ascii="Arial" w:hAnsi="Arial" w:cs="Arial"/>
-          <w:sz w:val="18"/>
-        </w:rPr>
-        <w:fldChar w:fldCharType="begin"/>
-      </w:r>
-      <w:r>
-        <w:rPr>
-          <w:rFonts w:ascii="Arial" w:hAnsi="Arial" w:cs="Arial"/>
-          <w:sz w:val="18"/>
-        </w:rPr>
-        <w:instrText xml:space="preserve"> MERGEFIELD GENERO </w:instrText>
-      </w:r>
-      <w:r>
-        <w:rPr>
-          <w:rFonts w:ascii="Arial" w:hAnsi="Arial" w:cs="Arial"/>
-          <w:sz w:val="18"/>
-        </w:rPr>
-        <w:fldChar w:fldCharType="separate"/>
-      </w:r>
-      <w:r>
-        <w:rPr>
-          <w:rFonts w:ascii="Arial" w:hAnsi="Arial" w:cs="Arial"/>
-          <w:noProof/>
-          <w:sz w:val="18"/>
-        </w:rPr>
-        <w:instrText>M</w:instrText>
-      </w:r>
-      <w:r>
-        <w:rPr>
-          <w:rFonts w:ascii="Arial" w:hAnsi="Arial" w:cs="Arial"/>
-          <w:sz w:val="18"/>
-        </w:rPr>
-        <w:fldChar w:fldCharType="end"/>
-      </w:r>
-      <w:r>
-        <w:rPr>
-          <w:rFonts w:ascii="Arial" w:hAnsi="Arial" w:cs="Arial"/>
-          <w:sz w:val="18"/>
-        </w:rPr>
-        <w:instrText xml:space="preserve"> = "F" "a la" "al" </w:instrText>
-      </w:r>
-      <w:r>
-        <w:rPr>
-          <w:rFonts w:ascii="Arial" w:hAnsi="Arial" w:cs="Arial"/>
-          <w:sz w:val="18"/>
-        </w:rPr>
-        <w:fldChar w:fldCharType="separate"/>
-      </w:r>
-      <w:r>
-        <w:rPr>
-          <w:rFonts w:ascii="Arial" w:hAnsi="Arial" w:cs="Arial"/>
-          <w:noProof/>
-          <w:sz w:val="18"/>
-        </w:rPr>
-        <w:instrText>al</w:instrText>
-      </w:r>
-      <w:r>
-        <w:rPr>
-          <w:rFonts w:ascii="Arial" w:hAnsi="Arial" w:cs="Arial"/>
-          <w:sz w:val="18"/>
-        </w:rPr>
-        <w:fldChar w:fldCharType="end"/>
-      </w:r>
-      <w:r>
-        <w:rPr>
-          <w:rFonts w:ascii="Arial" w:eastAsia="Arial" w:hAnsi="Arial" w:cs="Arial"/>
-          <w:color w:val="111111"/>
-          <w:sz w:val="18"/>
-          <w:szCs w:val="18"/>
-        </w:rPr>
-        <w:instrText xml:space="preserve"> trabajador</w:instrText>
-      </w:r>
-      <w:r>
-        <w:rPr>
-          <w:rFonts w:ascii="Arial" w:hAnsi="Arial" w:cs="Arial"/>
-          <w:sz w:val="18"/>
-        </w:rPr>
-        <w:fldChar w:fldCharType="begin"/>
-      </w:r>
-      <w:r>
-        <w:rPr>
-          <w:rFonts w:ascii="Arial" w:hAnsi="Arial" w:cs="Arial"/>
-          <w:sz w:val="18"/>
-        </w:rPr>
-        <w:instrText xml:space="preserve"> IF </w:instrText>
-      </w:r>
-      <w:r>
-        <w:rPr>
-          <w:rFonts w:ascii="Arial" w:hAnsi="Arial" w:cs="Arial"/>
-          <w:sz w:val="18"/>
-        </w:rPr>
-        <w:fldChar w:fldCharType="begin"/>
-      </w:r>
-      <w:r>
-        <w:rPr>
-          <w:rFonts w:ascii="Arial" w:hAnsi="Arial" w:cs="Arial"/>
-          <w:sz w:val="18"/>
-        </w:rPr>
-        <w:instrText xml:space="preserve"> MERGEFIELD GENERO </w:instrText>
-      </w:r>
-      <w:r>
-        <w:rPr>
-          <w:rFonts w:ascii="Arial" w:hAnsi="Arial" w:cs="Arial"/>
-          <w:sz w:val="18"/>
-        </w:rPr>
-        <w:fldChar w:fldCharType="separate"/>
-      </w:r>
-      <w:r>
-        <w:rPr>
-          <w:rFonts w:ascii="Arial" w:hAnsi="Arial" w:cs="Arial"/>
-          <w:noProof/>
-          <w:sz w:val="18"/>
-        </w:rPr>
-        <w:instrText>M</w:instrText>
-      </w:r>
-      <w:r>
-        <w:rPr>
-          <w:rFonts w:ascii="Arial" w:hAnsi="Arial" w:cs="Arial"/>
-          <w:sz w:val="18"/>
-        </w:rPr>
-        <w:fldChar w:fldCharType="end"/>
-      </w:r>
-      <w:r>
-        <w:rPr>
-          <w:rFonts w:ascii="Arial" w:hAnsi="Arial" w:cs="Arial"/>
-          <w:sz w:val="18"/>
-        </w:rPr>
-        <w:instrText xml:space="preserve"> = "F" "a" "" </w:instrText>
-      </w:r>
-      <w:r>
-        <w:rPr>
-          <w:rFonts w:ascii="Arial" w:hAnsi="Arial" w:cs="Arial"/>
-          <w:sz w:val="18"/>
-        </w:rPr>
-        <w:fldChar w:fldCharType="end"/>
-      </w:r>
-      <w:r>
-        <w:rPr>
-          <w:rFonts w:ascii="Arial" w:eastAsia="Arial" w:hAnsi="Arial" w:cs="Arial"/>
-          <w:color w:val="111111"/>
-          <w:sz w:val="18"/>
-          <w:szCs w:val="18"/>
-        </w:rPr>
-        <w:instrText xml:space="preserve"> un bono por movilización ascendente a la suma de $ </w:instrText>
-      </w:r>
-      <w:r>
-        <w:rPr>
-          <w:rFonts w:ascii="Arial" w:eastAsia="Arial" w:hAnsi="Arial" w:cs="Arial"/>
-          <w:color w:val="111111"/>
-          <w:sz w:val="18"/>
-          <w:szCs w:val="18"/>
-        </w:rPr>
-        <w:fldChar w:fldCharType="begin"/>
-      </w:r>
-      <w:r>
-        <w:rPr>
-          <w:rFonts w:ascii="Arial" w:eastAsia="Arial" w:hAnsi="Arial" w:cs="Arial"/>
-          <w:color w:val="111111"/>
-          <w:sz w:val="18"/>
-          <w:szCs w:val="18"/>
-        </w:rPr>
-        <w:instrText xml:space="preserve"> MERGEFIELD BONO_MOV </w:instrText>
-      </w:r>
-      <w:r>
-        <w:rPr>
-          <w:rFonts w:ascii="Arial" w:eastAsia="Arial" w:hAnsi="Arial" w:cs="Arial"/>
-          <w:color w:val="111111"/>
-          <w:sz w:val="18"/>
-          <w:szCs w:val="18"/>
-        </w:rPr>
-        <w:fldChar w:fldCharType="separate"/>
-      </w:r>
-      <w:r>
-        <w:rPr>
-          <w:rFonts w:ascii="Arial" w:eastAsia="Arial" w:hAnsi="Arial" w:cs="Arial"/>
-          <w:noProof/>
-          <w:color w:val="111111"/>
-          <w:sz w:val="18"/>
-          <w:szCs w:val="18"/>
-        </w:rPr>
-        <w:instrText>60.000</w:instrText>
-      </w:r>
-      <w:r>
-        <w:rPr>
-          <w:rFonts w:ascii="Arial" w:eastAsia="Arial" w:hAnsi="Arial" w:cs="Arial"/>
-          <w:color w:val="111111"/>
-          <w:sz w:val="18"/>
-          <w:szCs w:val="18"/>
-        </w:rPr>
-        <w:fldChar w:fldCharType="end"/>
-      </w:r>
-      <w:r>
-        <w:rPr>
-          <w:rFonts w:ascii="Arial" w:eastAsia="Arial" w:hAnsi="Arial" w:cs="Arial"/>
-          <w:color w:val="111111"/>
-          <w:sz w:val="18"/>
-          <w:szCs w:val="18"/>
-        </w:rPr>
-        <w:instrText xml:space="preserve"> (</w:instrText>
-      </w:r>
-      <w:r>
-        <w:rPr>
-          <w:rFonts w:ascii="Arial" w:eastAsia="Arial" w:hAnsi="Arial" w:cs="Arial"/>
-          <w:color w:val="111111"/>
-          <w:sz w:val="18"/>
-          <w:szCs w:val="18"/>
-        </w:rPr>
-        <w:fldChar w:fldCharType="begin"/>
-      </w:r>
-      <w:r>
-        <w:rPr>
-          <w:rFonts w:ascii="Arial" w:eastAsia="Arial" w:hAnsi="Arial" w:cs="Arial"/>
-          <w:color w:val="111111"/>
-          <w:sz w:val="18"/>
-          <w:szCs w:val="18"/>
-        </w:rPr>
-        <w:instrText xml:space="preserve"> MERGEFIELD BONO_MOV_P </w:instrText>
-      </w:r>
-      <w:r>
-        <w:rPr>
-          <w:rFonts w:ascii="Arial" w:eastAsia="Arial" w:hAnsi="Arial" w:cs="Arial"/>
-          <w:color w:val="111111"/>
-          <w:sz w:val="18"/>
-          <w:szCs w:val="18"/>
-        </w:rPr>
-        <w:fldChar w:fldCharType="separate"/>
-      </w:r>
-      <w:r>
-        <w:rPr>
-          <w:rFonts w:ascii="Arial" w:eastAsia="Arial" w:hAnsi="Arial" w:cs="Arial"/>
-          <w:noProof/>
-          <w:color w:val="111111"/>
-          <w:sz w:val="18"/>
-          <w:szCs w:val="18"/>
-        </w:rPr>
-        <w:instrText>SESENTA MIL PESOS</w:instrText>
-      </w:r>
-      <w:r>
-        <w:rPr>
-          <w:rFonts w:ascii="Arial" w:eastAsia="Arial" w:hAnsi="Arial" w:cs="Arial"/>
-          <w:color w:val="111111"/>
-          <w:sz w:val="18"/>
-          <w:szCs w:val="18"/>
-        </w:rPr>
-        <w:fldChar w:fldCharType="end"/>
-      </w:r>
-      <w:r>
-        <w:rPr>
-          <w:rFonts w:ascii="Arial" w:eastAsia="Arial" w:hAnsi="Arial" w:cs="Arial"/>
-          <w:color w:val="111111"/>
-          <w:sz w:val="18"/>
-          <w:szCs w:val="18"/>
-        </w:rPr>
-        <w:instrText>), un bono de colación ascendente a la suma de $</w:instrText>
-      </w:r>
-      <w:r>
-        <w:rPr>
-          <w:rFonts w:ascii="Arial" w:eastAsia="Arial" w:hAnsi="Arial" w:cs="Arial"/>
-          <w:color w:val="111111"/>
-          <w:sz w:val="18"/>
-          <w:szCs w:val="18"/>
-        </w:rPr>
-        <w:fldChar w:fldCharType="begin"/>
-      </w:r>
-      <w:r>
-        <w:rPr>
-          <w:rFonts w:ascii="Arial" w:eastAsia="Arial" w:hAnsi="Arial" w:cs="Arial"/>
-          <w:color w:val="111111"/>
-          <w:sz w:val="18"/>
-          <w:szCs w:val="18"/>
-        </w:rPr>
-        <w:instrText xml:space="preserve"> MERGEFIELD BONO_COL </w:instrText>
-      </w:r>
-      <w:r>
-        <w:rPr>
-          <w:rFonts w:ascii="Arial" w:eastAsia="Arial" w:hAnsi="Arial" w:cs="Arial"/>
-          <w:color w:val="111111"/>
-          <w:sz w:val="18"/>
-          <w:szCs w:val="18"/>
-        </w:rPr>
-        <w:fldChar w:fldCharType="separate"/>
-      </w:r>
-      <w:r>
-        <w:rPr>
-          <w:rFonts w:ascii="Arial" w:eastAsia="Arial" w:hAnsi="Arial" w:cs="Arial"/>
-          <w:noProof/>
-          <w:color w:val="111111"/>
-          <w:sz w:val="18"/>
-          <w:szCs w:val="18"/>
-        </w:rPr>
-        <w:instrText>60.000</w:instrText>
-      </w:r>
-      <w:r>
-        <w:rPr>
-          <w:rFonts w:ascii="Arial" w:eastAsia="Arial" w:hAnsi="Arial" w:cs="Arial"/>
-          <w:color w:val="111111"/>
-          <w:sz w:val="18"/>
-          <w:szCs w:val="18"/>
-        </w:rPr>
-        <w:fldChar w:fldCharType="end"/>
-      </w:r>
-      <w:r>
-        <w:rPr>
-          <w:rFonts w:ascii="Arial" w:eastAsia="Arial" w:hAnsi="Arial" w:cs="Arial"/>
-          <w:color w:val="111111"/>
-          <w:sz w:val="18"/>
-          <w:szCs w:val="18"/>
-        </w:rPr>
-        <w:instrText xml:space="preserve"> (</w:instrText>
-      </w:r>
-      <w:r>
-        <w:rPr>
-          <w:rFonts w:ascii="Arial" w:eastAsia="Arial" w:hAnsi="Arial" w:cs="Arial"/>
-          <w:noProof/>
-          <w:color w:val="111111"/>
-          <w:sz w:val="18"/>
-          <w:szCs w:val="18"/>
-        </w:rPr>
-        <w:fldChar w:fldCharType="begin"/>
-      </w:r>
-      <w:r>
-        <w:rPr>
-          <w:rFonts w:ascii="Arial" w:eastAsia="Arial" w:hAnsi="Arial" w:cs="Arial"/>
-          <w:noProof/>
-          <w:color w:val="111111"/>
-          <w:sz w:val="18"/>
-          <w:szCs w:val="18"/>
-        </w:rPr>
-        <w:instrText xml:space="preserve"> MERGEFIELD BONO_COL_P </w:instrText>
-      </w:r>
-      <w:r>
-        <w:rPr>
-          <w:rFonts w:ascii="Arial" w:eastAsia="Arial" w:hAnsi="Arial" w:cs="Arial"/>
-          <w:noProof/>
-          <w:color w:val="111111"/>
-          <w:sz w:val="18"/>
-          <w:szCs w:val="18"/>
-        </w:rPr>
-        <w:fldChar w:fldCharType="separate"/>
-      </w:r>
-      <w:r>
-        <w:rPr>
-          <w:rFonts w:ascii="Arial" w:eastAsia="Arial" w:hAnsi="Arial" w:cs="Arial"/>
-          <w:noProof/>
-          <w:color w:val="111111"/>
-          <w:sz w:val="18"/>
-          <w:szCs w:val="18"/>
-        </w:rPr>
-        <w:instrText>SESENTA MIL PESOS</w:instrText>
-      </w:r>
-      <w:r>
-        <w:rPr>
-          <w:rFonts w:ascii="Arial" w:eastAsia="Arial" w:hAnsi="Arial" w:cs="Arial"/>
-          <w:noProof/>
-          <w:color w:val="111111"/>
-          <w:sz w:val="18"/>
-          <w:szCs w:val="18"/>
-        </w:rPr>
-        <w:fldChar w:fldCharType="end"/>
-      </w:r>
-      <w:r>
-        <w:rPr>
-          <w:rFonts w:ascii="Arial" w:eastAsia="Arial" w:hAnsi="Arial" w:cs="Arial"/>
-          <w:color w:val="111111"/>
-          <w:sz w:val="18"/>
-          <w:szCs w:val="18"/>
-        </w:rPr>
-        <w:instrText>), por cada mes que haya prestado servicios a CONAF en virtud del presente contrato.</w:instrText>
+        <w:t>{</w:t>
+      </w:r>
+      <w:proofErr w:type="spellStart"/>
+      <w:r>
+        <w:rPr>
+          <w:rFonts w:ascii="Arial" w:eastAsia="Arial" w:hAnsi="Arial" w:cs="Arial"/>
+          <w:color w:val="111111"/>
+          <w:sz w:val="18"/>
+          <w:szCs w:val="18"/>
+        </w:rPr>
+        <w:t>d.bonos.mostrar</w:t>
+      </w:r>
+      <w:proofErr w:type="gramStart"/>
+      <w:r>
+        <w:rPr>
+          <w:rFonts w:ascii="Arial" w:eastAsia="Arial" w:hAnsi="Arial" w:cs="Arial"/>
+          <w:color w:val="111111"/>
+          <w:sz w:val="18"/>
+          <w:szCs w:val="18"/>
+        </w:rPr>
+        <w:t>:ifEQ</w:t>
+      </w:r>
+      <w:proofErr w:type="spellEnd"/>
+      <w:proofErr w:type="gramEnd"/>
+      <w:r>
+        <w:rPr>
+          <w:rFonts w:ascii="Arial" w:eastAsia="Arial" w:hAnsi="Arial" w:cs="Arial"/>
+          <w:color w:val="111111"/>
+          <w:sz w:val="18"/>
+          <w:szCs w:val="18"/>
+        </w:rPr>
+        <w:t>(true):</w:t>
+      </w:r>
+      <w:proofErr w:type="spellStart"/>
+      <w:r>
+        <w:rPr>
+          <w:rFonts w:ascii="Arial" w:eastAsia="Arial" w:hAnsi="Arial" w:cs="Arial"/>
+          <w:color w:val="111111"/>
+          <w:sz w:val="18"/>
+          <w:szCs w:val="18"/>
+        </w:rPr>
+        <w:t>showBegin</w:t>
+      </w:r>
+      <w:proofErr w:type="spellEnd"/>
+      <w:r>
+        <w:rPr>
+          <w:rFonts w:ascii="Arial" w:eastAsia="Arial" w:hAnsi="Arial" w:cs="Arial"/>
+          <w:color w:val="111111"/>
+          <w:sz w:val="18"/>
+          <w:szCs w:val="18"/>
+        </w:rPr>
+        <w:t>}</w:t>
       </w:r>
     </w:p>
     <w:p>
@@ -13171,141 +12546,6 @@
           <w:tab w:val="left" w:pos="1276"/>
         </w:tabs>
         <w:spacing w:after="0" w:line="206" w:lineRule="exact"/>
-        <w:ind w:left="1276" w:right="68" w:hanging="1168"/>
-        <w:jc w:val="both"/>
-        <w:rPr>
-          <w:rFonts w:ascii="Arial" w:eastAsia="Arial" w:hAnsi="Arial" w:cs="Arial"/>
-          <w:color w:val="111111"/>
-          <w:sz w:val="18"/>
-          <w:szCs w:val="18"/>
-        </w:rPr>
-      </w:pPr>
-    </w:p>
-    <w:p>
-      <w:pPr>
-        <w:tabs>
-          <w:tab w:val="left" w:pos="1418"/>
-        </w:tabs>
-        <w:spacing w:after="0" w:line="240" w:lineRule="auto"/>
-        <w:ind w:left="1440" w:right="68" w:hanging="556"/>
-        <w:jc w:val="both"/>
-        <w:rPr>
-          <w:rFonts w:ascii="Arial" w:eastAsia="Arial" w:hAnsi="Arial" w:cs="Arial"/>
-          <w:color w:val="111111"/>
-          <w:sz w:val="18"/>
-          <w:szCs w:val="18"/>
-        </w:rPr>
-      </w:pPr>
-      <w:r>
-        <w:rPr>
-          <w:rFonts w:ascii="Arial" w:eastAsia="Arial" w:hAnsi="Arial" w:cs="Arial"/>
-          <w:color w:val="111111"/>
-          <w:sz w:val="18"/>
-          <w:szCs w:val="18"/>
-        </w:rPr>
-        <w:instrText>Precisado por el artículo 41 del Código del Trabajo, el inciso 2° del mismo p</w:instrText>
-      </w:r>
-      <w:r>
-        <w:rPr>
-          <w:rFonts w:ascii="Arial" w:eastAsia="Arial" w:hAnsi="Arial" w:cs="Arial"/>
-          <w:color w:val="111111"/>
-          <w:sz w:val="18"/>
-          <w:szCs w:val="18"/>
-        </w:rPr>
-        <w:instrText xml:space="preserve">recepto legal, la asignación de </w:instrText>
-      </w:r>
-    </w:p>
-    <w:p>
-      <w:pPr>
-        <w:tabs>
-          <w:tab w:val="left" w:pos="1418"/>
-        </w:tabs>
-        <w:spacing w:after="0" w:line="240" w:lineRule="auto"/>
-        <w:ind w:left="1440" w:right="68" w:hanging="556"/>
-        <w:jc w:val="both"/>
-        <w:rPr>
-          <w:rFonts w:ascii="Arial" w:eastAsia="Arial" w:hAnsi="Arial" w:cs="Arial"/>
-          <w:color w:val="111111"/>
-          <w:sz w:val="18"/>
-          <w:szCs w:val="18"/>
-        </w:rPr>
-      </w:pPr>
-      <w:r>
-        <w:rPr>
-          <w:rFonts w:ascii="Arial" w:eastAsia="Arial" w:hAnsi="Arial" w:cs="Arial"/>
-          <w:color w:val="111111"/>
-          <w:sz w:val="18"/>
-          <w:szCs w:val="18"/>
-        </w:rPr>
-        <w:instrText xml:space="preserve">movilización presenta un carácter compensatorio, no constituye remuneración y se pagara </w:instrText>
-      </w:r>
-    </w:p>
-    <w:p>
-      <w:pPr>
-        <w:tabs>
-          <w:tab w:val="left" w:pos="1418"/>
-        </w:tabs>
-        <w:spacing w:after="0" w:line="240" w:lineRule="auto"/>
-        <w:ind w:left="1440" w:right="68" w:hanging="556"/>
-        <w:jc w:val="both"/>
-        <w:rPr>
-          <w:rFonts w:ascii="Arial" w:eastAsia="Arial" w:hAnsi="Arial" w:cs="Arial"/>
-          <w:color w:val="111111"/>
-          <w:sz w:val="18"/>
-          <w:szCs w:val="18"/>
-        </w:rPr>
-      </w:pPr>
-      <w:r>
-        <w:rPr>
-          <w:rFonts w:ascii="Arial" w:eastAsia="Arial" w:hAnsi="Arial" w:cs="Arial"/>
-          <w:color w:val="111111"/>
-          <w:sz w:val="18"/>
-          <w:szCs w:val="18"/>
-        </w:rPr>
-        <w:instrText>proporcionalmente a los días trabajados.</w:instrText>
-      </w:r>
-    </w:p>
-    <w:p>
-      <w:pPr>
-        <w:tabs>
-          <w:tab w:val="left" w:pos="1418"/>
-        </w:tabs>
-        <w:spacing w:after="0" w:line="240" w:lineRule="auto"/>
-        <w:ind w:right="68"/>
-        <w:jc w:val="both"/>
-        <w:rPr>
-          <w:rFonts w:ascii="Arial" w:eastAsia="Arial" w:hAnsi="Arial" w:cs="Arial"/>
-          <w:noProof/>
-          <w:color w:val="111111"/>
-          <w:sz w:val="18"/>
-          <w:szCs w:val="18"/>
-        </w:rPr>
-      </w:pPr>
-      <w:r>
-        <w:rPr>
-          <w:rFonts w:ascii="Arial" w:eastAsia="Arial" w:hAnsi="Arial" w:cs="Arial"/>
-          <w:color w:val="111111"/>
-          <w:sz w:val="18"/>
-          <w:szCs w:val="18"/>
-        </w:rPr>
-        <w:instrText xml:space="preserve">" "" </w:instrText>
-      </w:r>
-      <w:r>
-        <w:rPr>
-          <w:rFonts w:ascii="Arial" w:eastAsia="Arial" w:hAnsi="Arial" w:cs="Arial"/>
-          <w:color w:val="111111"/>
-          <w:sz w:val="18"/>
-          <w:szCs w:val="18"/>
-        </w:rPr>
-        <w:fldChar w:fldCharType="separate"/>
-      </w:r>
-    </w:p>
-    <w:p>
-      <w:pPr>
-        <w:tabs>
-          <w:tab w:val="left" w:pos="1418"/>
-        </w:tabs>
-        <w:spacing w:after="0" w:line="240" w:lineRule="auto"/>
         <w:ind w:left="1418" w:right="68" w:hanging="1418"/>
         <w:jc w:val="both"/>
         <w:rPr>
@@ -13318,21 +12558,138 @@
       <w:r>
         <w:rPr>
           <w:rFonts w:ascii="Arial" w:eastAsia="Arial" w:hAnsi="Arial" w:cs="Arial"/>
-          <w:noProof/>
-          <w:color w:val="111111"/>
-          <w:sz w:val="18"/>
-          <w:szCs w:val="18"/>
-        </w:rPr>
-        <w:t>{d.bonos.mostrar:ifEQ(true):showBegin}NOVENO: Las partes acuerdan que la Corporación otorgará {d.g.al_trabajador} un bono por movilización ascendente a la suma de $ {d.bonos.mov_texto} ({d.bonos.mov_palabras}), un bono de colación ascendente a la suma de $ {d.bonos.col_texto} ({d.bonos.col_palabras}), por cada mes que haya prestado servicios a CONAF en virtud del presente contrato. Precisado por el artículo 41 del Código del Trabajo, el inciso 2° del mismo precepto legal, la asignación de movilización presenta un carácter compensatorio, no constituye remuneración y se pagará proporcionalmente a los días trabajados.{d.bonos.mostrar:showEnd}</w:t>
-      </w:r>
-      <w:r>
-        <w:rPr>
-          <w:rFonts w:ascii="Arial" w:eastAsia="Arial" w:hAnsi="Arial" w:cs="Arial"/>
-          <w:color w:val="111111"/>
-          <w:sz w:val="18"/>
-          <w:szCs w:val="18"/>
-        </w:rPr>
-        <w:fldChar w:fldCharType="end"/>
+          <w:color w:val="111111"/>
+          <w:sz w:val="18"/>
+          <w:szCs w:val="18"/>
+        </w:rPr>
+        <w:t xml:space="preserve">NOVENO: </w:t>
+      </w:r>
+      <w:r>
+        <w:rPr>
+          <w:rFonts w:ascii="Arial" w:eastAsia="Arial" w:hAnsi="Arial" w:cs="Arial"/>
+          <w:color w:val="111111"/>
+          <w:sz w:val="18"/>
+          <w:szCs w:val="18"/>
+        </w:rPr>
+        <w:tab/>
+      </w:r>
+      <w:r>
+        <w:rPr>
+          <w:rFonts w:ascii="Arial" w:eastAsia="Arial" w:hAnsi="Arial" w:cs="Arial"/>
+          <w:color w:val="111111"/>
+          <w:sz w:val="18"/>
+          <w:szCs w:val="18"/>
+        </w:rPr>
+        <w:tab/>
+      </w:r>
+      <w:r>
+        <w:rPr>
+          <w:rFonts w:ascii="Arial" w:eastAsia="Arial" w:hAnsi="Arial" w:cs="Arial"/>
+          <w:color w:val="111111"/>
+          <w:sz w:val="18"/>
+          <w:szCs w:val="18"/>
+        </w:rPr>
+        <w:t>Las partes acuerdan que la Corporación otorgará {</w:t>
+      </w:r>
+      <w:proofErr w:type="spellStart"/>
+      <w:r>
+        <w:rPr>
+          <w:rFonts w:ascii="Arial" w:eastAsia="Arial" w:hAnsi="Arial" w:cs="Arial"/>
+          <w:color w:val="111111"/>
+          <w:sz w:val="18"/>
+          <w:szCs w:val="18"/>
+        </w:rPr>
+        <w:t>d.g.al_trabajador</w:t>
+      </w:r>
+      <w:proofErr w:type="spellEnd"/>
+      <w:r>
+        <w:rPr>
+          <w:rFonts w:ascii="Arial" w:eastAsia="Arial" w:hAnsi="Arial" w:cs="Arial"/>
+          <w:color w:val="111111"/>
+          <w:sz w:val="18"/>
+          <w:szCs w:val="18"/>
+        </w:rPr>
+        <w:t>} un bono por movilización ascendente a la suma de $ {</w:t>
+      </w:r>
+      <w:proofErr w:type="spellStart"/>
+      <w:r>
+        <w:rPr>
+          <w:rFonts w:ascii="Arial" w:eastAsia="Arial" w:hAnsi="Arial" w:cs="Arial"/>
+          <w:color w:val="111111"/>
+          <w:sz w:val="18"/>
+          <w:szCs w:val="18"/>
+        </w:rPr>
+        <w:t>d.bonos.mov_texto</w:t>
+      </w:r>
+      <w:proofErr w:type="spellEnd"/>
+      <w:r>
+        <w:rPr>
+          <w:rFonts w:ascii="Arial" w:eastAsia="Arial" w:hAnsi="Arial" w:cs="Arial"/>
+          <w:color w:val="111111"/>
+          <w:sz w:val="18"/>
+          <w:szCs w:val="18"/>
+        </w:rPr>
+        <w:t>} ({</w:t>
+      </w:r>
+      <w:proofErr w:type="spellStart"/>
+      <w:r>
+        <w:rPr>
+          <w:rFonts w:ascii="Arial" w:eastAsia="Arial" w:hAnsi="Arial" w:cs="Arial"/>
+          <w:color w:val="111111"/>
+          <w:sz w:val="18"/>
+          <w:szCs w:val="18"/>
+        </w:rPr>
+        <w:t>d.bonos.mov_palabras</w:t>
+      </w:r>
+      <w:proofErr w:type="spellEnd"/>
+      <w:r>
+        <w:rPr>
+          <w:rFonts w:ascii="Arial" w:eastAsia="Arial" w:hAnsi="Arial" w:cs="Arial"/>
+          <w:color w:val="111111"/>
+          <w:sz w:val="18"/>
+          <w:szCs w:val="18"/>
+        </w:rPr>
+        <w:t>}), un bono de colación ascendente a la suma de $ {</w:t>
+      </w:r>
+      <w:proofErr w:type="spellStart"/>
+      <w:r>
+        <w:rPr>
+          <w:rFonts w:ascii="Arial" w:eastAsia="Arial" w:hAnsi="Arial" w:cs="Arial"/>
+          <w:color w:val="111111"/>
+          <w:sz w:val="18"/>
+          <w:szCs w:val="18"/>
+        </w:rPr>
+        <w:t>d.bonos.col_texto</w:t>
+      </w:r>
+      <w:proofErr w:type="spellEnd"/>
+      <w:r>
+        <w:rPr>
+          <w:rFonts w:ascii="Arial" w:eastAsia="Arial" w:hAnsi="Arial" w:cs="Arial"/>
+          <w:color w:val="111111"/>
+          <w:sz w:val="18"/>
+          <w:szCs w:val="18"/>
+        </w:rPr>
+        <w:t>} ({</w:t>
+      </w:r>
+      <w:proofErr w:type="spellStart"/>
+      <w:r>
+        <w:rPr>
+          <w:rFonts w:ascii="Arial" w:eastAsia="Arial" w:hAnsi="Arial" w:cs="Arial"/>
+          <w:color w:val="111111"/>
+          <w:sz w:val="18"/>
+          <w:szCs w:val="18"/>
+        </w:rPr>
+        <w:t>d.bonos.col_palabras</w:t>
+      </w:r>
+      <w:proofErr w:type="spellEnd"/>
+      <w:r>
+        <w:rPr>
+          <w:rFonts w:ascii="Arial" w:eastAsia="Arial" w:hAnsi="Arial" w:cs="Arial"/>
+          <w:color w:val="111111"/>
+          <w:sz w:val="18"/>
+          <w:szCs w:val="18"/>
+        </w:rPr>
+        <w:t>}), por cada mes que haya prestado servicios a CONAF en virtud del presente contrato. Precisado por el artículo 41 del Código del Trabajo, el inciso 2° del mismo precepto legal, la asignación de movilización presenta un carácter compensatorio, no constituye remuneración y se pagará proporcionalmente a los días trabajados.</w:t>
       </w:r>
     </w:p>
     <w:p>
@@ -13341,7 +12698,7 @@
           <w:tab w:val="left" w:pos="1276"/>
         </w:tabs>
         <w:spacing w:after="0" w:line="206" w:lineRule="exact"/>
-        <w:ind w:right="68"/>
+        <w:ind w:left="1418" w:right="68" w:hanging="1418"/>
         <w:jc w:val="both"/>
         <w:rPr>
           <w:rFonts w:ascii="Arial" w:eastAsia="Arial" w:hAnsi="Arial" w:cs="Arial"/>
@@ -13350,6 +12707,46 @@
           <w:szCs w:val="18"/>
         </w:rPr>
       </w:pPr>
+      <w:r>
+        <w:rPr>
+          <w:rFonts w:ascii="Arial" w:eastAsia="Arial" w:hAnsi="Arial" w:cs="Arial"/>
+          <w:color w:val="111111"/>
+          <w:sz w:val="18"/>
+          <w:szCs w:val="18"/>
+        </w:rPr>
+        <w:t>{</w:t>
+      </w:r>
+      <w:proofErr w:type="spellStart"/>
+      <w:r>
+        <w:rPr>
+          <w:rFonts w:ascii="Arial" w:eastAsia="Arial" w:hAnsi="Arial" w:cs="Arial"/>
+          <w:color w:val="111111"/>
+          <w:sz w:val="18"/>
+          <w:szCs w:val="18"/>
+        </w:rPr>
+        <w:t>d.bonos.mostrar</w:t>
+      </w:r>
+      <w:proofErr w:type="gramStart"/>
+      <w:r>
+        <w:rPr>
+          <w:rFonts w:ascii="Arial" w:eastAsia="Arial" w:hAnsi="Arial" w:cs="Arial"/>
+          <w:color w:val="111111"/>
+          <w:sz w:val="18"/>
+          <w:szCs w:val="18"/>
+        </w:rPr>
+        <w:t>:showEnd</w:t>
+      </w:r>
+      <w:proofErr w:type="spellEnd"/>
+      <w:proofErr w:type="gramEnd"/>
+      <w:r>
+        <w:rPr>
+          <w:rFonts w:ascii="Arial" w:eastAsia="Arial" w:hAnsi="Arial" w:cs="Arial"/>
+          <w:color w:val="111111"/>
+          <w:sz w:val="18"/>
+          <w:szCs w:val="18"/>
+        </w:rPr>
+        <w:t>}</w:t>
+      </w:r>
     </w:p>
     <w:p>
       <w:pPr>
@@ -13787,7 +13184,25 @@
                 <w:sz w:val="18"/>
                 <w:szCs w:val="18"/>
               </w:rPr>
-              <w:t>} {</w:t>
+              <w:t xml:space="preserve">} </w:t>
+            </w:r>
+            <w:r>
+              <w:rPr>
+                <w:rFonts w:ascii="Arial" w:eastAsia="Arial" w:hAnsi="Arial" w:cs="Arial"/>
+                <w:color w:val="0F0F0F"/>
+                <w:sz w:val="18"/>
+                <w:szCs w:val="18"/>
+              </w:rPr>
+              <w:t xml:space="preserve"> </w:t>
+            </w:r>
+            <w:r>
+              <w:rPr>
+                <w:rFonts w:ascii="Arial" w:eastAsia="Arial" w:hAnsi="Arial" w:cs="Arial"/>
+                <w:color w:val="0F0F0F"/>
+                <w:sz w:val="18"/>
+                <w:szCs w:val="18"/>
+              </w:rPr>
+              <w:t>{</w:t>
             </w:r>
             <w:proofErr w:type="spellStart"/>
             <w:r>
@@ -13837,15 +13252,6 @@
                 <w:szCs w:val="18"/>
               </w:rPr>
               <w:t>}</w:t>
-            </w:r>
-            <w:r>
-              <w:rPr>
-                <w:rFonts w:ascii="Arial" w:eastAsia="Arial" w:hAnsi="Arial" w:cs="Arial"/>
-                <w:color w:val="0F0F0F"/>
-                <w:sz w:val="18"/>
-                <w:szCs w:val="18"/>
-              </w:rPr>
-              <w:t xml:space="preserve"> </w:t>
             </w:r>
           </w:p>
           <w:p>
@@ -13899,7 +13305,19 @@
                 <w:sz w:val="17"/>
                 <w:szCs w:val="17"/>
               </w:rPr>
-              <w:t>} - {</w:t>
+              <w:t>} -</w:t>
+            </w:r>
+            <w:bookmarkStart w:id="0" w:name="_GoBack"/>
+            <w:bookmarkEnd w:id="0"/>
+            <w:r>
+              <w:rPr>
+                <w:rFonts w:ascii="Arial" w:eastAsia="Arial" w:hAnsi="Arial" w:cs="Arial"/>
+                <w:color w:val="111111"/>
+                <w:w w:val="101"/>
+                <w:sz w:val="17"/>
+                <w:szCs w:val="17"/>
+              </w:rPr>
+              <w:t>{</w:t>
             </w:r>
             <w:proofErr w:type="spellStart"/>
             <w:r>
@@ -15425,7 +14843,7 @@
 </file>
 
 <file path=customXml/itemProps1.xml><?xml version="1.0" encoding="utf-8"?>
-<ds:datastoreItem xmlns:ds="http://schemas.openxmlformats.org/officeDocument/2006/customXml" ds:itemID="{9C12CE3B-7F31-4E97-926E-4E5B8F31E457}">
+<ds:datastoreItem xmlns:ds="http://schemas.openxmlformats.org/officeDocument/2006/customXml" ds:itemID="{A365E92F-FC50-4091-B4F2-F6D13266D68F}">
   <ds:schemaRefs>
     <ds:schemaRef ds:uri="http://schemas.openxmlformats.org/officeDocument/2006/bibliography"/>
   </ds:schemaRefs>

</xml_diff>

<commit_message>
feat: implementación de etiqueta de marca de asistencia, implementacion de seccion de edicion de usuario
</commit_message>
<xml_diff>
--- a/plantillas/contrato-trabajo.docx
+++ b/plantillas/contrato-trabajo.docx
@@ -455,6 +455,15 @@
               <w:fldChar w:fldCharType="begin"/>
             </w:r>
             <w:r>
+              <w:instrText xml:space="preserve"> INCLUDEPICTURE  \d "C:\\Users\\Constanza.Ramos\\Logos\\conadi.png" \* MERGEFORMATINET </w:instrText>
+            </w:r>
+            <w:r>
+              <w:fldChar w:fldCharType="separate"/>
+            </w:r>
+            <w:r>
+              <w:fldChar w:fldCharType="begin"/>
+            </w:r>
+            <w:r>
               <w:instrText xml:space="preserve"> </w:instrText>
             </w:r>
             <w:r>
@@ -491,6 +500,9 @@
                   <v:imagedata r:id="rId10"/>
                 </v:shape>
               </w:pict>
+            </w:r>
+            <w:r>
+              <w:fldChar w:fldCharType="end"/>
             </w:r>
             <w:r>
               <w:fldChar w:fldCharType="end"/>
@@ -5867,9 +5879,8 @@
           <w:szCs w:val="18"/>
           <w:lang w:val="es-ES_tradnl" w:eastAsia="es-ES"/>
         </w:rPr>
-        <w:t xml:space="preserve"> reloj biométrico </w:t>
-      </w:r>
-      <w:proofErr w:type="spellStart"/>
+        <w:t xml:space="preserve"> </w:t>
+      </w:r>
       <w:r>
         <w:rPr>
           <w:rFonts w:ascii="Arial" w:eastAsia="Times New Roman" w:hAnsi="Arial" w:cs="Arial"/>
@@ -5877,18 +5888,10 @@
           <w:szCs w:val="18"/>
           <w:lang w:val="es-ES_tradnl" w:eastAsia="es-ES"/>
         </w:rPr>
-        <w:t>geovictoria</w:t>
-      </w:r>
-      <w:proofErr w:type="spellEnd"/>
-      <w:r>
-        <w:rPr>
-          <w:rFonts w:ascii="Arial" w:eastAsia="Times New Roman" w:hAnsi="Arial" w:cs="Arial"/>
-          <w:sz w:val="18"/>
-          <w:szCs w:val="18"/>
-          <w:lang w:val="es-ES_tradnl" w:eastAsia="es-ES"/>
-        </w:rPr>
-        <w:t xml:space="preserve"> box</w:t>
-      </w:r>
+        <w:t>{d.contrato.control_asistencia}</w:t>
+      </w:r>
+      <w:bookmarkStart w:id="0" w:name="_GoBack"/>
+      <w:bookmarkEnd w:id="0"/>
       <w:r>
         <w:rPr>
           <w:rFonts w:ascii="Arial" w:eastAsia="Times New Roman" w:hAnsi="Arial" w:cs="Arial"/>
@@ -13307,8 +13310,6 @@
               </w:rPr>
               <w:t>} -</w:t>
             </w:r>
-            <w:bookmarkStart w:id="0" w:name="_GoBack"/>
-            <w:bookmarkEnd w:id="0"/>
             <w:r>
               <w:rPr>
                 <w:rFonts w:ascii="Arial" w:eastAsia="Arial" w:hAnsi="Arial" w:cs="Arial"/>
@@ -14843,7 +14844,7 @@
 </file>
 
 <file path=customXml/itemProps1.xml><?xml version="1.0" encoding="utf-8"?>
-<ds:datastoreItem xmlns:ds="http://schemas.openxmlformats.org/officeDocument/2006/customXml" ds:itemID="{A365E92F-FC50-4091-B4F2-F6D13266D68F}">
+<ds:datastoreItem xmlns:ds="http://schemas.openxmlformats.org/officeDocument/2006/customXml" ds:itemID="{0B1A6DCB-71E4-420D-A95E-D5F6C1ACB73A}">
   <ds:schemaRefs>
     <ds:schemaRef ds:uri="http://schemas.openxmlformats.org/officeDocument/2006/bibliography"/>
   </ds:schemaRefs>

</xml_diff>